<commit_message>
Catch-up commit - dissertation edits done outside session wrap
</commit_message>
<xml_diff>
--- a/Dissertation/Mvula_Dissertation_Final.docx
+++ b/Dissertation/Mvula_Dissertation_Final.docx
@@ -1621,7 +1621,7 @@
           <w:i w:val="0"/>
           <w:sz w:val="24"/>
         </w:rPr>
-        <w:t>To examine the influence of perceived usefulness and perceived ease of use on AI-powered learning technology adoption among accounting and finance students in Zambia.</w:t>
+        <w:t>To determine the extent to which perceived usefulness and perceived ease of use influence the adoption of AI-powered learning technologies among accounting and finance students in Zambia.</w:t>
       </w:r>
     </w:p>
     <w:p>
@@ -1637,7 +1637,7 @@
           <w:i w:val="0"/>
           <w:sz w:val="24"/>
         </w:rPr>
-        <w:t>To assess the influence of digital literacy and self-efficacy on AI-powered learning technology adoption among accounting and finance students in Zambia.</w:t>
+        <w:t>To assess the influence of individual factors, specifically digital literacy and self-efficacy, on the adoption of AI-powered learning technologies among these students.</w:t>
       </w:r>
     </w:p>
     <w:p>
@@ -1653,7 +1653,7 @@
           <w:i w:val="0"/>
           <w:sz w:val="24"/>
         </w:rPr>
-        <w:t>To investigate the influence of institutional support, peer influence, and awareness of AI tools on AI-powered learning technology adoption among accounting and finance students in Zambia.</w:t>
+        <w:t>To examine the influence of institutional support, social or peer influence, and awareness of AI tools on the adoption of AI-powered learning technologies among these students.</w:t>
       </w:r>
     </w:p>
     <w:p>
@@ -1689,10 +1689,6 @@
     </w:p>
     <w:p>
       <w:pPr>
-        <w:numPr>
-          <w:ilvl w:val="0"/>
-          <w:numId w:val="10"/>
-        </w:numPr>
         <w:pStyle w:val="ListNumber"/>
         <w:spacing w:before="0" w:after="80"/>
         <w:jc w:val="both"/>
@@ -1704,15 +1700,11 @@
           <w:i w:val="0"/>
           <w:sz w:val="24"/>
         </w:rPr>
-        <w:t>To what extent do perceived usefulness and perceived ease of use influence AI-powered learning technology adoption among accounting and finance students in Zambia?</w:t>
-      </w:r>
-    </w:p>
-    <w:p>
-      <w:pPr>
-        <w:numPr>
-          <w:ilvl w:val="0"/>
-          <w:numId w:val="10"/>
-        </w:numPr>
+        <w:t>To what extent do perceived usefulness and perceived ease of use influence the adoption of AI-powered learning technologies among accounting and finance students in Zambia?</w:t>
+      </w:r>
+    </w:p>
+    <w:p>
+      <w:pPr>
         <w:pStyle w:val="ListNumber"/>
         <w:spacing w:before="0" w:after="80"/>
         <w:jc w:val="both"/>
@@ -1724,15 +1716,11 @@
           <w:i w:val="0"/>
           <w:sz w:val="24"/>
         </w:rPr>
-        <w:t>How do digital literacy and self-efficacy influence AI-powered learning technology adoption among accounting and finance students in Zambia?</w:t>
-      </w:r>
-    </w:p>
-    <w:p>
-      <w:pPr>
-        <w:numPr>
-          <w:ilvl w:val="0"/>
-          <w:numId w:val="10"/>
-        </w:numPr>
+        <w:t>How do digital literacy and self-efficacy influence the adoption of AI-powered learning technologies among these students?</w:t>
+      </w:r>
+    </w:p>
+    <w:p>
+      <w:pPr>
         <w:pStyle w:val="ListNumber"/>
         <w:spacing w:before="0" w:after="80"/>
         <w:jc w:val="both"/>
@@ -1744,7 +1732,7 @@
           <w:i w:val="0"/>
           <w:sz w:val="24"/>
         </w:rPr>
-        <w:t>What is the influence of institutional support, peer influence, and awareness of AI tools on AI-powered learning technology adoption among accounting and finance students in Zambia?</w:t>
+        <w:t>What is the influence of institutional support, social or peer influence, and awareness of AI tools on the adoption of AI-powered learning technologies among these students?</w:t>
       </w:r>
     </w:p>
     <w:p>
@@ -12187,12 +12175,6 @@
   <w:num w:numId="9">
     <w:abstractNumId w:val="0"/>
   </w:num>
-  <w:num w:numId="10">
-    <w:abstractNumId w:val="7"/>
-    <w:lvlOverride w:ilvl="0">
-      <w:startOverride w:val="1"/>
-    </w:lvlOverride>
-  </w:num>
 </w:numbering>
 </file>
 

</xml_diff>